<commit_message>
Se corrige unos puntos de soluciones de cambio
</commit_message>
<xml_diff>
--- a/Soluciones de cambio.docx
+++ b/Soluciones de cambio.docx
@@ -77,6 +77,27 @@
       </w:r>
       <w:r>
         <w:t>Actualmente el sistema está orientado principalmente al manejo de medicamentos. Aunque permite crear distintas variantes de estos, la lógica de construcción de los productos se encuentra acoplada a la aplicación y la gestión de archivos está mezclada con la lógica del negocio. Esto dificulta la incorporación de nuevas categorías de productos y hace que el sistema sea más complejo de mantener a medida que crece.</w:t>
+      </w:r>
+    </w:p>
+    <w:p>
+      <w:pPr>
+        <w:numPr>
+          <w:ilvl w:val="0"/>
+          <w:numId w:val="1"/>
+        </w:numPr>
+      </w:pPr>
+      <w:r>
+        <w:rPr>
+          <w:b/>
+          <w:bCs/>
+        </w:rPr>
+        <w:t>Línea base (arquitectura actual, sin rediseño):</w:t>
+      </w:r>
+      <w:r>
+        <w:br/>
+      </w:r>
+      <w:r>
+        <w:t xml:space="preserve">Agregar hoy un nuevo tipo de producto obligaría a modificar como mínimo ServicioProducto.cs (líneas 99-107: CargarDesdeArchivo construye siempre un MedicamentoCapsula con TipoRelleno.Gel hardcodeado, sin despacho por tipo) y ProductoFactory.cs (agregar un nuevo método Crear*). El riesgo es que tocar ese método sin cuidado afecte la carga de los productos existentes desde productos.txt.</w:t>
       </w:r>
     </w:p>
     <w:p>
@@ -319,7 +340,7 @@
         <w:t xml:space="preserve"> </w:t>
       </w:r>
       <w:r>
-        <w:t>Modificar la estructura del archivo para soportar nuevas categorías y atributos, aceptando la pérdida de compatibilidad con el formato anterior.</w:t>
+        <w:t>Modificar la estructura del archivo para soportar nuevas categorías y atributos, preservando la compatibilidad con el formato actual durante la transición (ver Mitigación).</w:t>
       </w:r>
     </w:p>
     <w:p>
@@ -422,6 +443,27 @@
       </w:r>
       <w:r>
         <w:t>Actualmente, el proceso de venta y el registro de movimientos están diseñados únicamente para trabajar con productos físicos, ya que asumen que todos los elementos tienen stock. Esto dificulta incorporar servicios, como inyectología o curaciones, porque obliga a asignarles características que realmente no les corresponden.</w:t>
+      </w:r>
+    </w:p>
+    <w:p>
+      <w:pPr>
+        <w:numPr>
+          <w:ilvl w:val="0"/>
+          <w:numId w:val="2"/>
+        </w:numPr>
+      </w:pPr>
+      <w:r>
+        <w:rPr>
+          <w:b/>
+          <w:bCs/>
+        </w:rPr>
+        <w:t>Línea base (arquitectura actual, sin rediseño):</w:t>
+      </w:r>
+      <w:r>
+        <w:br/>
+      </w:r>
+      <w:r>
+        <w:t xml:space="preserve">Producto.cs (líneas 12-14) obliga a Stock, StockMinimo y FechaVencimiento en todo lo que se venda, y Program.cs (línea 280) hace productoVenta.Stock -= cantidad directamente durante la venta. Modelar hoy un servicio médico como Producto rompería ese cálculo o forzaría valores ficticios de stock/vencimiento sin sentido de negocio.</w:t>
       </w:r>
     </w:p>
     <w:p>
@@ -613,44 +655,12 @@
           <w:numId w:val="8"/>
         </w:numPr>
       </w:pPr>
-      <w:proofErr w:type="spellStart"/>
-      <w:r>
-        <w:rPr>
-          <w:b/>
-          <w:bCs/>
-        </w:rPr>
-        <w:t>AppFarmaciaConsola</w:t>
-      </w:r>
-      <w:proofErr w:type="spellEnd"/>
-      <w:r>
-        <w:rPr>
-          <w:b/>
-          <w:bCs/>
-        </w:rPr>
-        <w:t>/</w:t>
-      </w:r>
-      <w:r>
-        <w:rPr>
-          <w:b/>
-          <w:bCs/>
-        </w:rPr>
-        <w:t xml:space="preserve"> </w:t>
-      </w:r>
-      <w:proofErr w:type="spellStart"/>
-      <w:r>
-        <w:rPr>
-          <w:b/>
-          <w:bCs/>
-        </w:rPr>
-        <w:t>Movimiento.cs</w:t>
-      </w:r>
-      <w:proofErr w:type="spellEnd"/>
-      <w:r>
-        <w:rPr>
-          <w:b/>
-          <w:bCs/>
-        </w:rPr>
-        <w:t>:</w:t>
+      <w:r>
+        <w:rPr>
+          <w:b/>
+          <w:bCs/>
+        </w:rPr>
+        <w:t>BibFarmacia/Clases/Movimiento.cs:</w:t>
       </w:r>
       <w:r>
         <w:t xml:space="preserve"> </w:t>
@@ -762,7 +772,7 @@
           <w:b/>
           <w:bCs/>
         </w:rPr>
-        <w:t>insitucional</w:t>
+        <w:t>institucional</w:t>
       </w:r>
       <w:proofErr w:type="spellEnd"/>
     </w:p>
@@ -812,7 +822,28 @@
         <w:br/>
       </w:r>
       <w:r>
-        <w:t>Actualmente el sistema aplica un porcentaje fijo de descuento y no contempla reglas específicas para cada tipo de convenio. Esto implica que, cada vez que se incorpore una nueva entidad o modalidad de beneficio, será necesario modificar la lógica existente en varios componentes del sistema, incrementando el acoplamiento y dificultando su mantenimiento.</w:t>
+        <w:t>Actualmente el sistema tiene definido un porcentaje fijo de descuento (ServicioDescuento.CalcularDescuento) que no se invoca en ningún punto del flujo de venta, y no contempla reglas específicas para cada tipo de convenio. Esto implica que, cada vez que se incorpore una nueva entidad o modalidad de beneficio, será necesario construir y conectar esa lógica en varios componentes del sistema, incrementando el acoplamiento y dificultando su mantenimiento.</w:t>
+      </w:r>
+    </w:p>
+    <w:p>
+      <w:pPr>
+        <w:numPr>
+          <w:ilvl w:val="0"/>
+          <w:numId w:val="3"/>
+        </w:numPr>
+      </w:pPr>
+      <w:r>
+        <w:rPr>
+          <w:b/>
+          <w:bCs/>
+        </w:rPr>
+        <w:t>Línea base (arquitectura actual, sin rediseño):</w:t>
+      </w:r>
+      <w:r>
+        <w:br/>
+      </w:r>
+      <w:r>
+        <w:t xml:space="preserve">ServicioDescuento.cs (línea 15) tiene el 10% fijo, pero no se invoca desde ningún punto de Program.cs hoy: el flujo de venta actual no aplica ningún descuento observable. Activar descuentos por convenio es, sobre la arquitectura actual, un cambio casi puramente aditivo.</w:t>
       </w:r>
     </w:p>
     <w:p>

</xml_diff>